<commit_message>
docs: sync current supplement and render receipt
</commit_message>
<xml_diff>
--- a/results/paper/condensed_candidate_20261028_01/年报与法规双源RAG_精简补充材料_预算与BM25检索诊断候选稿_待终审.docx
+++ b/results/paper/condensed_candidate_20261028_01/年报与法规双源RAG_精简补充材料_预算与BM25检索诊断候选稿_待终审.docx
@@ -3270,7 +3270,7 @@
         <w:widowControl/>
       </w:pPr>
       <w:r>
-        <w:t>补充表S3 法规定位粒度拆分 不同分母不得直接比较</w:t>
+        <w:t>补充表S3 法规定位粒度拆分（PDF页级：40题、120个目标定位；TXT来源：20题；分母不同，不直接比较）</w:t>
       </w:r>
     </w:p>
     <w:tbl>
@@ -3383,7 +3383,9 @@
                 <w:color w:val="000000"/>
                 <w:sz w:val="18"/>
               </w:rPr>
-              <w:t>PDF-only 40题页覆盖</w:t>
+              <w:t>PDF页级覆盖</w:t>
+              <w:br/>
+              <w:t>n=120个定位</w:t>
             </w:r>
           </w:p>
         </w:tc>
@@ -3415,7 +3417,9 @@
                 <w:color w:val="000000"/>
                 <w:sz w:val="18"/>
               </w:rPr>
-              <w:t>TXT-only 20题来源命中</w:t>
+              <w:t>TXT来源命中</w:t>
+              <w:br/>
+              <w:t>n=20题</w:t>
             </w:r>
           </w:p>
         </w:tc>

</xml_diff>